<commit_message>
docs(generalization): longer paper, two parallel verification domains
Reframe biomedical HSI (Lichens, Collagen) as a second VERIFICATION domain
(not prior work). Expand HAR section with dataset/training detail + explicit
select->verify flow + reduction-vs-accuracy Table I vs alternatives. Add brief
biomedical Table II + bar figure (existing verified numbers: 192->80 88.2->95.2%,
192->9 ->89.4%, 158->30 79.8->85.6%). Relabel cross-domain table to two
symmetric domains. Abstract now reports concrete reduction-vs-accuracy.

Co-Authored-By: Claude Opus 4.7 (1M context) <noreply@anthropic.com>
</commit_message>
<xml_diff>
--- a/generalization/Meloyan_GeneralChannelSelection.docx
+++ b/generalization/Meloyan_GeneralChannelSelection.docx
@@ -78,7 +78,7 @@
           <w:i/>
           <w:sz w:val="19"/>
         </w:rPr>
-        <w:t>Modern sensing systems produce many channels that are highly correlated and organized into coupled groups. Choosing a small, interpretable subset of the original channels—without labels—reduces cost and complexity, but existing options force a trade-off: unsupervised filters (variance, PCA) ignore inter-channel dependency, while dependency-aware selectors (mRMR, JMI) require labels. We present an unsupervised method that captures channel dependency directly. A group-structured autoencoder learns a joint representation across channel groups; each channel's importance is measured by the sensitivity of the reconstruction to perturbations of the learned latent factors; and a relevance-redundancy criterion selects a diverse, informative subset of the actual channels. The method is discrete—it returns real channels, not a projection—and interpretable. Originally developed for multi-excitation hyperspectral imaging, where it identifies discriminative wavelength bands and outperforms classical band-selection baselines, the same selection procedure transfers to a very different modality with only a domain-appropriate encoder. On a standard wearable-sensor human-activity-recognition benchmark, evaluated with leave-one-subject-out cross-validation, the label-free method matches supervised mutual-information selection and is substantially more stable across subjects than variance-based selection. A single dependency-aware, label-free selection principle thus generalizes across markedly different sensor modalities.</w:t>
+        <w:t>Modern sensors emit many overlapping channels arranged in coupled groups. Selecting a small, interpretable subset of the original channels—without labels—lowers cost and aids interpretation, yet existing methods trade off: unsupervised filters (variance, PCA) ignore inter-channel dependency, while dependency-aware selectors (mRMR, JMI) require labels. We present an unsupervised, dependency-aware, and discrete selector. A group-structured autoencoder learns a joint representation of the channels; perturbing its latent factors measures each channel's reconstruction sensitivity (relevance); and a relevance-redundancy rule chooses a diverse subset of the real channels. We verify the same method in two very different domains, changing only the encoder. On a wearable-sensor human-activity-recognition benchmark (three inertial units, 27 channels, leave-one-subject-out), retaining ten channels (a 63% reduction) preserves macro-F1 to within 0.04 of the full set and matches a supervised mutual-information selector, while being substantially more stable across subjects than variance selection. On biomedical hyperspectral imaging, the same method reduces channels by 58-95% while maintaining or improving classification accuracy (e.g., 192 to 80 bands raises accuracy from 88.2% to 95.2%; 158 to 30 bands from 79.8% to 85.6%). A single label-free principle thus delivers strong, interpretable channel reduction across modalities.</w:t>
       </w:r>
     </w:p>
     <w:p>
@@ -132,7 +132,23 @@
           <w:i w:val="0"/>
           <w:sz w:val="19"/>
         </w:rPr>
-        <w:t>Complex sensors emit many channels that overlap heavily and arrive in natural groups—the three axes of one inertial unit, or the emission bands of one excitation. For cost, power, and interpretability one often wants to retain only a handful of the actual channels, not a learned mixture of them. Existing selectors force a trade-off. Unsupervised filters such as variance ranking and PCA judge each channel by its marginal statistics and ignore inter-channel dependency. Dependency-aware selectors such as mRMR and JMI model conditional relevance but require labels. The cell that is label-free, dependency-aware, and discrete is sparsely populated; this work targets it and, more importantly, shows that one such method generalizes across very different sensor modalities.</w:t>
+        <w:t>Complex sensors emit many channels that overlap heavily and arrive in natural groups—the three axes of one inertial unit, or the emission bands measured under one excitation. For cost, power, transmission, and interpretability, one often wants to keep only a handful of the actual channels, not a learned mixture of them. The challenge is to decide which channels to keep without labels.</w:t>
+      </w:r>
+    </w:p>
+    <w:p>
+      <w:pPr>
+        <w:spacing w:before="0" w:after="40" w:line="240" w:lineRule="auto"/>
+        <w:ind w:firstLine="259"/>
+        <w:jc w:val="both"/>
+      </w:pPr>
+      <w:r>
+        <w:rPr>
+          <w:rFonts w:ascii="Times New Roman" w:hAnsi="Times New Roman"/>
+          <w:b w:val="0"/>
+          <w:i w:val="0"/>
+          <w:sz w:val="19"/>
+        </w:rPr>
+        <w:t>Existing selectors force a trade-off. Unsupervised filters such as variance ranking or PCA score each channel by its own statistics and ignore how channels depend on one another, so they tend to keep several channels that carry the same information. Dependency-aware selectors such as mRMR or JMI account for this redundancy but need labels. The cell that is at once label-free, dependency-aware, and discrete (returning real channels, not a projection) is sparsely occupied. This paper presents a method for that cell and, more importantly, shows that one such method works across two very different sensing modalities by changing only its front-end encoder.</w:t>
       </w:r>
     </w:p>
     <w:p>
@@ -163,7 +179,7 @@
           <w:i w:val="0"/>
           <w:sz w:val="19"/>
         </w:rPr>
-        <w:t>The method has three stages (Fig. 1). First, a group-structured autoencoder is trained by reconstruction alone—no labels: each channel group is encoded separately, the per-group features are mean-fused into a shared latent representation, and the latent is decoded back to each group. Second, perturbation-based attribution nudges individual latent factors and measures how much each channel's reconstruction changes; channels the model relies on react strongly. Third, a relevance-redundancy (maximal marginal relevance) criterion greedily selects channels that are individually informative yet non-redundant with those already chosen. The output is a discrete, ordered, interpretable subset of the real channels that can be thresholded to any target size.</w:t>
+        <w:t>The method has three simple stages (Fig. 1). (1) A group-structured autoencoder is trained by reconstruction only—no labels. Each channel group has its own small encoder; the per-group features are averaged into one shared latent representation, which is then decoded back to every group. (2) We probe what the model learned: nudging one latent factor and measuring how much each channel's reconstruction changes gives that channel's relevance—channels the model depends on react strongly. (3) A relevance-redundancy rule (maximal marginal relevance) then picks channels one at a time, preferring those that are informative yet not already represented by a previously chosen channel. The output is an ordered, interpretable list of real channels that can be cut to any target size.</w:t>
       </w:r>
     </w:p>
     <w:p>
@@ -227,7 +243,7 @@
           <w:rFonts w:ascii="Times New Roman" w:hAnsi="Times New Roman"/>
           <w:sz w:val="16"/>
         </w:rPr>
-        <w:t>Fig. 1.  The selection pipeline. The engine (perturbation → per-channel influence → relevance-redundancy selection) is identical across domains; only the encoder/decoder changes with the data's regular axis.</w:t>
+        <w:t>Fig. 1.  The three-stage pipeline. The selection engine (perturbation -&gt; per-channel relevance -&gt; relevance-redundancy selection) is identical across domains; only the encoder/decoder changes to match the data's regular axis.</w:t>
       </w:r>
     </w:p>
     <w:p>
@@ -243,21 +259,6 @@
     </w:p>
     <w:p>
       <w:pPr>
-        <w:spacing w:before="120" w:after="40" w:line="240" w:lineRule="auto"/>
-        <w:jc w:val="center"/>
-      </w:pPr>
-      <w:r>
-        <w:rPr>
-          <w:rFonts w:ascii="Times New Roman" w:hAnsi="Times New Roman"/>
-          <w:b/>
-          <w:smallCaps/>
-          <w:sz w:val="19"/>
-        </w:rPr>
-        <w:t>III. CROSS-DOMAIN TRANSFER</w:t>
-      </w:r>
-    </w:p>
-    <w:p>
-      <w:pPr>
         <w:spacing w:before="0" w:after="40" w:line="240" w:lineRule="auto"/>
         <w:ind w:firstLine="259"/>
         <w:jc w:val="both"/>
@@ -269,7 +270,7 @@
           <w:i w:val="0"/>
           <w:sz w:val="19"/>
         </w:rPr>
-        <w:t>The selection engine is modality-agnostic: it operates on an abstract layout of groups, channels, and one regular axis. Moving to a new modality requires only an encoder matched to that axis (Fig. 2). The method was originally developed for multi-excitation hyperspectral imaging, where a group is an excitation wavelength, a channel is an emission band, the regular axis is 2-D space, and a 3-D convolutional encoder is used; there it identifies discriminative bands and outperforms classical band-selection baselines. For wearable human-activity recognition, a group is a body-worn inertial unit, a channel is one sensor axis, and the regular axis is time, so a 1-D convolutional encoder is substituted. No part of the selection logic was rewritten.</w:t>
+        <w:t>Crucially, the selection engine is modality-agnostic: it works on an abstract layout of groups, channels, and one regular axis (space or time). Moving to a new modality requires only an encoder matched to that axis (Fig. 2). We verify the same engine on two domains.</w:t>
       </w:r>
     </w:p>
     <w:p>
@@ -333,7 +334,7 @@
           <w:rFonts w:ascii="Times New Roman" w:hAnsi="Times New Roman"/>
           <w:sz w:val="16"/>
         </w:rPr>
-        <w:t>Fig. 2.  The same method instantiated in two modalities. Only the encoder changes.</w:t>
+        <w:t>Fig. 2.  One method, two verification domains. Only the encoder changes (1-D temporal convolutions for wearable sensors; 2-D/3-D spatial convolutions for imaging).</w:t>
       </w:r>
     </w:p>
     <w:p>
@@ -359,7 +360,7 @@
           <w:smallCaps/>
           <w:sz w:val="19"/>
         </w:rPr>
-        <w:t>IV. EXPERIMENTS AND RESULTS</w:t>
+        <w:t>III. VERIFICATION 1: WEARABLE-SENSOR ACTIVITY RECOGNITION</w:t>
       </w:r>
     </w:p>
     <w:p>
@@ -375,7 +376,23 @@
           <w:i w:val="0"/>
           <w:sz w:val="19"/>
         </w:rPr>
-        <w:t>We evaluate on a standard wearable-sensor activity-recognition benchmark with three body-worn inertial units, using leave-one-subject-out cross-validation and macro-F1, the rigorous protocol in which the test subject is never seen during training. We compare the label-free method against a supervised mutual-information selector, an unsupervised variance baseline, and random selection, sweeping the number of retained channels.</w:t>
+        <w:t>Dataset. We use PAMAP2, a standard human-activity-recognition (HAR) benchmark recorded from three body-worn inertial measurement units (IMUs) placed on the hand, chest, and ankle, sampled at 100 Hz. Each IMU contributes nine channels (3-axis accelerometer, gyroscope, and magnetometer), giving 27 channels organized into three natural groups. We use the preprocessed release with fixed one-second windows, yielding 38,856 windows across eight subjects and twelve activity classes.</w:t>
+      </w:r>
+    </w:p>
+    <w:p>
+      <w:pPr>
+        <w:spacing w:before="0" w:after="40" w:line="240" w:lineRule="auto"/>
+        <w:ind w:firstLine="259"/>
+        <w:jc w:val="both"/>
+      </w:pPr>
+      <w:r>
+        <w:rPr>
+          <w:rFonts w:ascii="Times New Roman" w:hAnsi="Times New Roman"/>
+          <w:b w:val="0"/>
+          <w:i w:val="0"/>
+          <w:sz w:val="19"/>
+        </w:rPr>
+        <w:t>Protocol (the selection-then-verification flow). For each held-out subject we (i) train the group autoencoder unsupervised on the remaining subjects' windows, with one IMU per group and a 1-D temporal-convolution encoder; (ii) run the selection engine to obtain an ordered channel list; and (iii) verify the chosen subset by training a k-nearest-neighbour classifier on those channels and measuring macro-F1 on the held-out subject. All numbers are leave-one-subject-out (LOSO) means—the rigorous protocol in which the test subject is never seen during training. We compare against a supervised mutual-information selector, an unsupervised variance baseline, and random selection.</w:t>
       </w:r>
     </w:p>
     <w:p>
@@ -428,7 +445,7 @@
           <w:rFonts w:ascii="Times New Roman" w:hAnsi="Times New Roman"/>
           <w:sz w:val="16"/>
         </w:rPr>
-        <w:t>Fig. 3.  Macro-F1 vs. number of selected channels (leave-one-subject-out). The label-free method (red) tracks the supervised selector (blue) and exceeds variance (orange).</w:t>
+        <w:t>Fig. 3.  Macro-F1 versus number of retained channels (LOSO). The label-free method (red) tracks the supervised selector (blue) and stays above variance (orange).</w:t>
       </w:r>
     </w:p>
     <w:p>
@@ -444,8 +461,387 @@
           <w:i w:val="0"/>
           <w:sz w:val="19"/>
         </w:rPr>
-        <w:t>Two results stand out. First, the label-free method matches the supervised mutual-information selector across channel budgets, achieving without labels what the supervised method requires labels to attain. Second, it consistently exceeds the variance baseline and—crucially for deployment—selects far more stably across subjects (Fig. 4): variance selection swings widely from subject to subject, whereas the proposed method does not. We note in the interest of full disclosure that on this particular benchmark no selector, including the supervised one, surpasses random selection: its channels are intrinsically redundant, so almost any moderate subset approaches the all-channel ceiling. The comparison against a supervised selector and the stability analysis are therefore the informative axes here.</w:t>
+        <w:t>Results (Table I). Reducing from 27 to 10 channels (a 63% reduction) keeps macro-F1 within 0.04 of the full set, and the label-free method matches the supervised selector at every budget while clearly beating variance. It also selects far more consistently across subjects (Fig. 4): variance swings widely from person to person, whereas our method does not—important when a single sensor set must be fixed before deployment. For full transparency, on this particular benchmark no selector, including the supervised one, surpasses random selection, because the 27 channels are highly redundant and almost any moderate subset approaches the full-set ceiling; the informative comparisons here are therefore against the supervised selector and on stability.</w:t>
       </w:r>
+    </w:p>
+    <w:p>
+      <w:pPr>
+        <w:sectPr>
+          <w:type w:val="continuous"/>
+          <w:pgSz w:w="12240" w:h="15840"/>
+          <w:pgMar w:top="1080" w:right="900" w:bottom="1440" w:left="900" w:header="720" w:footer="720" w:gutter="0"/>
+          <w:cols w:space="360" w:num="2" w:equalWidth="1"/>
+          <w:docGrid w:linePitch="360"/>
+        </w:sectPr>
+      </w:pPr>
+    </w:p>
+    <w:p>
+      <w:pPr>
+        <w:spacing w:before="80" w:after="20" w:line="240" w:lineRule="auto"/>
+        <w:jc w:val="center"/>
+      </w:pPr>
+      <w:r>
+        <w:rPr>
+          <w:rFonts w:ascii="Times New Roman" w:hAnsi="Times New Roman"/>
+          <w:b/>
+          <w:smallCaps/>
+          <w:sz w:val="16"/>
+        </w:rPr>
+        <w:t>TABLE I.  HAR macro-F1 under channel reduction (LOSO). Full set (27 ch) = 0.72.</w:t>
+      </w:r>
+    </w:p>
+    <w:tbl>
+      <w:tblPr>
+        <w:tblStyle w:val="TableGrid"/>
+        <w:tblW w:type="auto" w:w="0"/>
+        <w:jc w:val="center"/>
+        <w:tblLook w:firstColumn="1" w:firstRow="1" w:lastColumn="0" w:lastRow="0" w:noHBand="0" w:noVBand="1" w:val="04A0"/>
+      </w:tblPr>
+      <w:tblGrid>
+        <w:gridCol w:w="2610"/>
+        <w:gridCol w:w="2610"/>
+        <w:gridCol w:w="2610"/>
+        <w:gridCol w:w="2610"/>
+      </w:tblGrid>
+      <w:tr>
+        <w:tc>
+          <w:tcPr>
+            <w:tcW w:type="dxa" w:w="2610"/>
+          </w:tcPr>
+          <w:p>
+            <w:pPr>
+              <w:spacing w:before="0" w:after="0" w:line="240" w:lineRule="auto"/>
+              <w:jc w:val="center"/>
+            </w:pPr>
+            <w:r/>
+            <w:r>
+              <w:rPr>
+                <w:rFonts w:ascii="Times New Roman" w:hAnsi="Times New Roman"/>
+                <w:b/>
+                <w:sz w:val="16"/>
+              </w:rPr>
+              <w:t>Method</w:t>
+            </w:r>
+          </w:p>
+        </w:tc>
+        <w:tc>
+          <w:tcPr>
+            <w:tcW w:type="dxa" w:w="2610"/>
+          </w:tcPr>
+          <w:p>
+            <w:pPr>
+              <w:spacing w:before="0" w:after="0" w:line="240" w:lineRule="auto"/>
+              <w:jc w:val="center"/>
+            </w:pPr>
+            <w:r/>
+            <w:r>
+              <w:rPr>
+                <w:rFonts w:ascii="Times New Roman" w:hAnsi="Times New Roman"/>
+                <w:b/>
+                <w:sz w:val="16"/>
+              </w:rPr>
+              <w:t>10 ch (-63%)</w:t>
+            </w:r>
+          </w:p>
+        </w:tc>
+        <w:tc>
+          <w:tcPr>
+            <w:tcW w:type="dxa" w:w="2610"/>
+          </w:tcPr>
+          <w:p>
+            <w:pPr>
+              <w:spacing w:before="0" w:after="0" w:line="240" w:lineRule="auto"/>
+              <w:jc w:val="center"/>
+            </w:pPr>
+            <w:r/>
+            <w:r>
+              <w:rPr>
+                <w:rFonts w:ascii="Times New Roman" w:hAnsi="Times New Roman"/>
+                <w:b/>
+                <w:sz w:val="16"/>
+              </w:rPr>
+              <w:t>7 ch (-74%)</w:t>
+            </w:r>
+          </w:p>
+        </w:tc>
+        <w:tc>
+          <w:tcPr>
+            <w:tcW w:type="dxa" w:w="2610"/>
+          </w:tcPr>
+          <w:p>
+            <w:pPr>
+              <w:spacing w:before="0" w:after="0" w:line="240" w:lineRule="auto"/>
+              <w:jc w:val="center"/>
+            </w:pPr>
+            <w:r/>
+            <w:r>
+              <w:rPr>
+                <w:rFonts w:ascii="Times New Roman" w:hAnsi="Times New Roman"/>
+                <w:b/>
+                <w:sz w:val="16"/>
+              </w:rPr>
+              <w:t>5 ch (-81%)</w:t>
+            </w:r>
+          </w:p>
+        </w:tc>
+      </w:tr>
+      <w:tr>
+        <w:tc>
+          <w:tcPr>
+            <w:tcW w:type="dxa" w:w="2610"/>
+          </w:tcPr>
+          <w:p>
+            <w:pPr>
+              <w:spacing w:before="0" w:after="0" w:line="240" w:lineRule="auto"/>
+              <w:jc w:val="center"/>
+            </w:pPr>
+            <w:r/>
+            <w:r>
+              <w:rPr>
+                <w:rFonts w:ascii="Times New Roman" w:hAnsi="Times New Roman"/>
+                <w:b w:val="0"/>
+                <w:sz w:val="16"/>
+              </w:rPr>
+              <w:t>Ours (label-free)</w:t>
+            </w:r>
+          </w:p>
+        </w:tc>
+        <w:tc>
+          <w:tcPr>
+            <w:tcW w:type="dxa" w:w="2610"/>
+          </w:tcPr>
+          <w:p>
+            <w:pPr>
+              <w:spacing w:before="0" w:after="0" w:line="240" w:lineRule="auto"/>
+              <w:jc w:val="center"/>
+            </w:pPr>
+            <w:r/>
+            <w:r>
+              <w:rPr>
+                <w:rFonts w:ascii="Times New Roman" w:hAnsi="Times New Roman"/>
+                <w:b w:val="0"/>
+                <w:sz w:val="16"/>
+              </w:rPr>
+              <w:t>0.68</w:t>
+            </w:r>
+          </w:p>
+        </w:tc>
+        <w:tc>
+          <w:tcPr>
+            <w:tcW w:type="dxa" w:w="2610"/>
+          </w:tcPr>
+          <w:p>
+            <w:pPr>
+              <w:spacing w:before="0" w:after="0" w:line="240" w:lineRule="auto"/>
+              <w:jc w:val="center"/>
+            </w:pPr>
+            <w:r/>
+            <w:r>
+              <w:rPr>
+                <w:rFonts w:ascii="Times New Roman" w:hAnsi="Times New Roman"/>
+                <w:b w:val="0"/>
+                <w:sz w:val="16"/>
+              </w:rPr>
+              <w:t>0.63</w:t>
+            </w:r>
+          </w:p>
+        </w:tc>
+        <w:tc>
+          <w:tcPr>
+            <w:tcW w:type="dxa" w:w="2610"/>
+          </w:tcPr>
+          <w:p>
+            <w:pPr>
+              <w:spacing w:before="0" w:after="0" w:line="240" w:lineRule="auto"/>
+              <w:jc w:val="center"/>
+            </w:pPr>
+            <w:r/>
+            <w:r>
+              <w:rPr>
+                <w:rFonts w:ascii="Times New Roman" w:hAnsi="Times New Roman"/>
+                <w:b w:val="0"/>
+                <w:sz w:val="16"/>
+              </w:rPr>
+              <w:t>0.54</w:t>
+            </w:r>
+          </w:p>
+        </w:tc>
+      </w:tr>
+      <w:tr>
+        <w:tc>
+          <w:tcPr>
+            <w:tcW w:type="dxa" w:w="2610"/>
+          </w:tcPr>
+          <w:p>
+            <w:pPr>
+              <w:spacing w:before="0" w:after="0" w:line="240" w:lineRule="auto"/>
+              <w:jc w:val="center"/>
+            </w:pPr>
+            <w:r/>
+            <w:r>
+              <w:rPr>
+                <w:rFonts w:ascii="Times New Roman" w:hAnsi="Times New Roman"/>
+                <w:b w:val="0"/>
+                <w:sz w:val="16"/>
+              </w:rPr>
+              <w:t>Mutual info (supervised)</w:t>
+            </w:r>
+          </w:p>
+        </w:tc>
+        <w:tc>
+          <w:tcPr>
+            <w:tcW w:type="dxa" w:w="2610"/>
+          </w:tcPr>
+          <w:p>
+            <w:pPr>
+              <w:spacing w:before="0" w:after="0" w:line="240" w:lineRule="auto"/>
+              <w:jc w:val="center"/>
+            </w:pPr>
+            <w:r/>
+            <w:r>
+              <w:rPr>
+                <w:rFonts w:ascii="Times New Roman" w:hAnsi="Times New Roman"/>
+                <w:b w:val="0"/>
+                <w:sz w:val="16"/>
+              </w:rPr>
+              <w:t>0.68</w:t>
+            </w:r>
+          </w:p>
+        </w:tc>
+        <w:tc>
+          <w:tcPr>
+            <w:tcW w:type="dxa" w:w="2610"/>
+          </w:tcPr>
+          <w:p>
+            <w:pPr>
+              <w:spacing w:before="0" w:after="0" w:line="240" w:lineRule="auto"/>
+              <w:jc w:val="center"/>
+            </w:pPr>
+            <w:r/>
+            <w:r>
+              <w:rPr>
+                <w:rFonts w:ascii="Times New Roman" w:hAnsi="Times New Roman"/>
+                <w:b w:val="0"/>
+                <w:sz w:val="16"/>
+              </w:rPr>
+              <w:t>0.61</w:t>
+            </w:r>
+          </w:p>
+        </w:tc>
+        <w:tc>
+          <w:tcPr>
+            <w:tcW w:type="dxa" w:w="2610"/>
+          </w:tcPr>
+          <w:p>
+            <w:pPr>
+              <w:spacing w:before="0" w:after="0" w:line="240" w:lineRule="auto"/>
+              <w:jc w:val="center"/>
+            </w:pPr>
+            <w:r/>
+            <w:r>
+              <w:rPr>
+                <w:rFonts w:ascii="Times New Roman" w:hAnsi="Times New Roman"/>
+                <w:b w:val="0"/>
+                <w:sz w:val="16"/>
+              </w:rPr>
+              <w:t>0.54</w:t>
+            </w:r>
+          </w:p>
+        </w:tc>
+      </w:tr>
+      <w:tr>
+        <w:tc>
+          <w:tcPr>
+            <w:tcW w:type="dxa" w:w="2610"/>
+          </w:tcPr>
+          <w:p>
+            <w:pPr>
+              <w:spacing w:before="0" w:after="0" w:line="240" w:lineRule="auto"/>
+              <w:jc w:val="center"/>
+            </w:pPr>
+            <w:r/>
+            <w:r>
+              <w:rPr>
+                <w:rFonts w:ascii="Times New Roman" w:hAnsi="Times New Roman"/>
+                <w:b w:val="0"/>
+                <w:sz w:val="16"/>
+              </w:rPr>
+              <w:t>Variance (unsupervised)</w:t>
+            </w:r>
+          </w:p>
+        </w:tc>
+        <w:tc>
+          <w:tcPr>
+            <w:tcW w:type="dxa" w:w="2610"/>
+          </w:tcPr>
+          <w:p>
+            <w:pPr>
+              <w:spacing w:before="0" w:after="0" w:line="240" w:lineRule="auto"/>
+              <w:jc w:val="center"/>
+            </w:pPr>
+            <w:r/>
+            <w:r>
+              <w:rPr>
+                <w:rFonts w:ascii="Times New Roman" w:hAnsi="Times New Roman"/>
+                <w:b w:val="0"/>
+                <w:sz w:val="16"/>
+              </w:rPr>
+              <w:t>0.59</w:t>
+            </w:r>
+          </w:p>
+        </w:tc>
+        <w:tc>
+          <w:tcPr>
+            <w:tcW w:type="dxa" w:w="2610"/>
+          </w:tcPr>
+          <w:p>
+            <w:pPr>
+              <w:spacing w:before="0" w:after="0" w:line="240" w:lineRule="auto"/>
+              <w:jc w:val="center"/>
+            </w:pPr>
+            <w:r/>
+            <w:r>
+              <w:rPr>
+                <w:rFonts w:ascii="Times New Roman" w:hAnsi="Times New Roman"/>
+                <w:b w:val="0"/>
+                <w:sz w:val="16"/>
+              </w:rPr>
+              <w:t>0.54</w:t>
+            </w:r>
+          </w:p>
+        </w:tc>
+        <w:tc>
+          <w:tcPr>
+            <w:tcW w:type="dxa" w:w="2610"/>
+          </w:tcPr>
+          <w:p>
+            <w:pPr>
+              <w:spacing w:before="0" w:after="0" w:line="240" w:lineRule="auto"/>
+              <w:jc w:val="center"/>
+            </w:pPr>
+            <w:r/>
+            <w:r>
+              <w:rPr>
+                <w:rFonts w:ascii="Times New Roman" w:hAnsi="Times New Roman"/>
+                <w:b w:val="0"/>
+                <w:sz w:val="16"/>
+              </w:rPr>
+              <w:t>0.51</w:t>
+            </w:r>
+          </w:p>
+        </w:tc>
+      </w:tr>
+    </w:tbl>
+    <w:p>
+      <w:pPr>
+        <w:sectPr>
+          <w:type w:val="continuous"/>
+          <w:pgSz w:w="12240" w:h="15840"/>
+          <w:pgMar w:top="1080" w:right="900" w:bottom="1440" w:left="900" w:header="720" w:footer="720" w:gutter="0"/>
+          <w:cols w:space="360" w:num="1" w:equalWidth="1"/>
+          <w:docGrid w:linePitch="360"/>
+        </w:sectPr>
+      </w:pPr>
     </w:p>
     <w:p>
       <w:pPr>
@@ -512,6 +908,469 @@
           <w:smallCaps/>
           <w:sz w:val="19"/>
         </w:rPr>
+        <w:t>IV. VERIFICATION 2: BIOMEDICAL HYPERSPECTRAL IMAGING</w:t>
+      </w:r>
+    </w:p>
+    <w:p>
+      <w:pPr>
+        <w:spacing w:before="0" w:after="40" w:line="240" w:lineRule="auto"/>
+        <w:ind w:firstLine="259"/>
+        <w:jc w:val="both"/>
+      </w:pPr>
+      <w:r>
+        <w:rPr>
+          <w:rFonts w:ascii="Times New Roman" w:hAnsi="Times New Roman"/>
+          <w:b w:val="0"/>
+          <w:i w:val="0"/>
+          <w:sz w:val="19"/>
+        </w:rPr>
+        <w:t>We verify the identical method on biomedical multi-excitation fluorescence hyperspectral imaging, where a group is an excitation wavelength, a channel is an emission band, and the regular axis is the 2-D image plane (a spatial-convolution encoder is substituted). On a lichen-tissue dataset (192 bands, four classes) the method reaches 95.2% classification accuracy using 80 of 192 bands—above the 88.2% obtained with all bands—and still achieves 89.4% using only nine bands (a 95% reduction). On a collagen dataset (158 bands, three classes), 30 bands raise accuracy from 79.8% to 85.6% (Table II, Fig. 5). In this high-redundancy imaging regime, intelligent selection clearly separates from trivial baselines, complementing the wearable-sensor result.</w:t>
+      </w:r>
+    </w:p>
+    <w:p>
+      <w:pPr>
+        <w:sectPr>
+          <w:type w:val="continuous"/>
+          <w:pgSz w:w="12240" w:h="15840"/>
+          <w:pgMar w:top="1080" w:right="900" w:bottom="1440" w:left="900" w:header="720" w:footer="720" w:gutter="0"/>
+          <w:cols w:space="360" w:num="2" w:equalWidth="1"/>
+          <w:docGrid w:linePitch="360"/>
+        </w:sectPr>
+      </w:pPr>
+    </w:p>
+    <w:p>
+      <w:pPr>
+        <w:spacing w:before="80" w:after="20" w:line="240" w:lineRule="auto"/>
+        <w:jc w:val="center"/>
+      </w:pPr>
+      <w:r>
+        <w:rPr>
+          <w:rFonts w:ascii="Times New Roman" w:hAnsi="Times New Roman"/>
+          <w:b/>
+          <w:smallCaps/>
+          <w:sz w:val="16"/>
+        </w:rPr>
+        <w:t>TABLE II.  Biomedical HSI: aggressive reduction maintains or improves accuracy.</w:t>
+      </w:r>
+    </w:p>
+    <w:tbl>
+      <w:tblPr>
+        <w:tblStyle w:val="TableGrid"/>
+        <w:tblW w:type="auto" w:w="0"/>
+        <w:jc w:val="center"/>
+        <w:tblLook w:firstColumn="1" w:firstRow="1" w:lastColumn="0" w:lastRow="0" w:noHBand="0" w:noVBand="1" w:val="04A0"/>
+      </w:tblPr>
+      <w:tblGrid>
+        <w:gridCol w:w="2610"/>
+        <w:gridCol w:w="2610"/>
+        <w:gridCol w:w="2610"/>
+        <w:gridCol w:w="2610"/>
+      </w:tblGrid>
+      <w:tr>
+        <w:tc>
+          <w:tcPr>
+            <w:tcW w:type="dxa" w:w="2610"/>
+          </w:tcPr>
+          <w:p>
+            <w:pPr>
+              <w:spacing w:before="0" w:after="0" w:line="240" w:lineRule="auto"/>
+              <w:jc w:val="center"/>
+            </w:pPr>
+            <w:r/>
+            <w:r>
+              <w:rPr>
+                <w:rFonts w:ascii="Times New Roman" w:hAnsi="Times New Roman"/>
+                <w:b/>
+                <w:sz w:val="16"/>
+              </w:rPr>
+              <w:t>Dataset</w:t>
+            </w:r>
+          </w:p>
+        </w:tc>
+        <w:tc>
+          <w:tcPr>
+            <w:tcW w:type="dxa" w:w="2610"/>
+          </w:tcPr>
+          <w:p>
+            <w:pPr>
+              <w:spacing w:before="0" w:after="0" w:line="240" w:lineRule="auto"/>
+              <w:jc w:val="center"/>
+            </w:pPr>
+            <w:r/>
+            <w:r>
+              <w:rPr>
+                <w:rFonts w:ascii="Times New Roman" w:hAnsi="Times New Roman"/>
+                <w:b/>
+                <w:sz w:val="16"/>
+              </w:rPr>
+              <w:t>Channels (all -&gt; kept)</w:t>
+            </w:r>
+          </w:p>
+        </w:tc>
+        <w:tc>
+          <w:tcPr>
+            <w:tcW w:type="dxa" w:w="2610"/>
+          </w:tcPr>
+          <w:p>
+            <w:pPr>
+              <w:spacing w:before="0" w:after="0" w:line="240" w:lineRule="auto"/>
+              <w:jc w:val="center"/>
+            </w:pPr>
+            <w:r/>
+            <w:r>
+              <w:rPr>
+                <w:rFonts w:ascii="Times New Roman" w:hAnsi="Times New Roman"/>
+                <w:b/>
+                <w:sz w:val="16"/>
+              </w:rPr>
+              <w:t>Reduction</w:t>
+            </w:r>
+          </w:p>
+        </w:tc>
+        <w:tc>
+          <w:tcPr>
+            <w:tcW w:type="dxa" w:w="2610"/>
+          </w:tcPr>
+          <w:p>
+            <w:pPr>
+              <w:spacing w:before="0" w:after="0" w:line="240" w:lineRule="auto"/>
+              <w:jc w:val="center"/>
+            </w:pPr>
+            <w:r/>
+            <w:r>
+              <w:rPr>
+                <w:rFonts w:ascii="Times New Roman" w:hAnsi="Times New Roman"/>
+                <w:b/>
+                <w:sz w:val="16"/>
+              </w:rPr>
+              <w:t>Accuracy (all -&gt; kept)</w:t>
+            </w:r>
+          </w:p>
+        </w:tc>
+      </w:tr>
+      <w:tr>
+        <w:tc>
+          <w:tcPr>
+            <w:tcW w:type="dxa" w:w="2610"/>
+          </w:tcPr>
+          <w:p>
+            <w:pPr>
+              <w:spacing w:before="0" w:after="0" w:line="240" w:lineRule="auto"/>
+              <w:jc w:val="center"/>
+            </w:pPr>
+            <w:r/>
+            <w:r>
+              <w:rPr>
+                <w:rFonts w:ascii="Times New Roman" w:hAnsi="Times New Roman"/>
+                <w:b w:val="0"/>
+                <w:sz w:val="16"/>
+              </w:rPr>
+              <w:t>Lichens</w:t>
+            </w:r>
+          </w:p>
+        </w:tc>
+        <w:tc>
+          <w:tcPr>
+            <w:tcW w:type="dxa" w:w="2610"/>
+          </w:tcPr>
+          <w:p>
+            <w:pPr>
+              <w:spacing w:before="0" w:after="0" w:line="240" w:lineRule="auto"/>
+              <w:jc w:val="center"/>
+            </w:pPr>
+            <w:r/>
+            <w:r>
+              <w:rPr>
+                <w:rFonts w:ascii="Times New Roman" w:hAnsi="Times New Roman"/>
+                <w:b w:val="0"/>
+                <w:sz w:val="16"/>
+              </w:rPr>
+              <w:t>192 -&gt; 80</w:t>
+            </w:r>
+          </w:p>
+        </w:tc>
+        <w:tc>
+          <w:tcPr>
+            <w:tcW w:type="dxa" w:w="2610"/>
+          </w:tcPr>
+          <w:p>
+            <w:pPr>
+              <w:spacing w:before="0" w:after="0" w:line="240" w:lineRule="auto"/>
+              <w:jc w:val="center"/>
+            </w:pPr>
+            <w:r/>
+            <w:r>
+              <w:rPr>
+                <w:rFonts w:ascii="Times New Roman" w:hAnsi="Times New Roman"/>
+                <w:b w:val="0"/>
+                <w:sz w:val="16"/>
+              </w:rPr>
+              <w:t>58%</w:t>
+            </w:r>
+          </w:p>
+        </w:tc>
+        <w:tc>
+          <w:tcPr>
+            <w:tcW w:type="dxa" w:w="2610"/>
+          </w:tcPr>
+          <w:p>
+            <w:pPr>
+              <w:spacing w:before="0" w:after="0" w:line="240" w:lineRule="auto"/>
+              <w:jc w:val="center"/>
+            </w:pPr>
+            <w:r/>
+            <w:r>
+              <w:rPr>
+                <w:rFonts w:ascii="Times New Roman" w:hAnsi="Times New Roman"/>
+                <w:b w:val="0"/>
+                <w:sz w:val="16"/>
+              </w:rPr>
+              <w:t>88.2% -&gt; 95.2%</w:t>
+            </w:r>
+          </w:p>
+        </w:tc>
+      </w:tr>
+      <w:tr>
+        <w:tc>
+          <w:tcPr>
+            <w:tcW w:type="dxa" w:w="2610"/>
+          </w:tcPr>
+          <w:p>
+            <w:pPr>
+              <w:spacing w:before="0" w:after="0" w:line="240" w:lineRule="auto"/>
+              <w:jc w:val="center"/>
+            </w:pPr>
+            <w:r/>
+            <w:r>
+              <w:rPr>
+                <w:rFonts w:ascii="Times New Roman" w:hAnsi="Times New Roman"/>
+                <w:b w:val="0"/>
+                <w:sz w:val="16"/>
+              </w:rPr>
+              <w:t>Lichens</w:t>
+            </w:r>
+          </w:p>
+        </w:tc>
+        <w:tc>
+          <w:tcPr>
+            <w:tcW w:type="dxa" w:w="2610"/>
+          </w:tcPr>
+          <w:p>
+            <w:pPr>
+              <w:spacing w:before="0" w:after="0" w:line="240" w:lineRule="auto"/>
+              <w:jc w:val="center"/>
+            </w:pPr>
+            <w:r/>
+            <w:r>
+              <w:rPr>
+                <w:rFonts w:ascii="Times New Roman" w:hAnsi="Times New Roman"/>
+                <w:b w:val="0"/>
+                <w:sz w:val="16"/>
+              </w:rPr>
+              <w:t>192 -&gt; 9</w:t>
+            </w:r>
+          </w:p>
+        </w:tc>
+        <w:tc>
+          <w:tcPr>
+            <w:tcW w:type="dxa" w:w="2610"/>
+          </w:tcPr>
+          <w:p>
+            <w:pPr>
+              <w:spacing w:before="0" w:after="0" w:line="240" w:lineRule="auto"/>
+              <w:jc w:val="center"/>
+            </w:pPr>
+            <w:r/>
+            <w:r>
+              <w:rPr>
+                <w:rFonts w:ascii="Times New Roman" w:hAnsi="Times New Roman"/>
+                <w:b w:val="0"/>
+                <w:sz w:val="16"/>
+              </w:rPr>
+              <w:t>95%</w:t>
+            </w:r>
+          </w:p>
+        </w:tc>
+        <w:tc>
+          <w:tcPr>
+            <w:tcW w:type="dxa" w:w="2610"/>
+          </w:tcPr>
+          <w:p>
+            <w:pPr>
+              <w:spacing w:before="0" w:after="0" w:line="240" w:lineRule="auto"/>
+              <w:jc w:val="center"/>
+            </w:pPr>
+            <w:r/>
+            <w:r>
+              <w:rPr>
+                <w:rFonts w:ascii="Times New Roman" w:hAnsi="Times New Roman"/>
+                <w:b w:val="0"/>
+                <w:sz w:val="16"/>
+              </w:rPr>
+              <w:t>88.2% -&gt; 89.4%</w:t>
+            </w:r>
+          </w:p>
+        </w:tc>
+      </w:tr>
+      <w:tr>
+        <w:tc>
+          <w:tcPr>
+            <w:tcW w:type="dxa" w:w="2610"/>
+          </w:tcPr>
+          <w:p>
+            <w:pPr>
+              <w:spacing w:before="0" w:after="0" w:line="240" w:lineRule="auto"/>
+              <w:jc w:val="center"/>
+            </w:pPr>
+            <w:r/>
+            <w:r>
+              <w:rPr>
+                <w:rFonts w:ascii="Times New Roman" w:hAnsi="Times New Roman"/>
+                <w:b w:val="0"/>
+                <w:sz w:val="16"/>
+              </w:rPr>
+              <w:t>Collagen</w:t>
+            </w:r>
+          </w:p>
+        </w:tc>
+        <w:tc>
+          <w:tcPr>
+            <w:tcW w:type="dxa" w:w="2610"/>
+          </w:tcPr>
+          <w:p>
+            <w:pPr>
+              <w:spacing w:before="0" w:after="0" w:line="240" w:lineRule="auto"/>
+              <w:jc w:val="center"/>
+            </w:pPr>
+            <w:r/>
+            <w:r>
+              <w:rPr>
+                <w:rFonts w:ascii="Times New Roman" w:hAnsi="Times New Roman"/>
+                <w:b w:val="0"/>
+                <w:sz w:val="16"/>
+              </w:rPr>
+              <w:t>158 -&gt; 30</w:t>
+            </w:r>
+          </w:p>
+        </w:tc>
+        <w:tc>
+          <w:tcPr>
+            <w:tcW w:type="dxa" w:w="2610"/>
+          </w:tcPr>
+          <w:p>
+            <w:pPr>
+              <w:spacing w:before="0" w:after="0" w:line="240" w:lineRule="auto"/>
+              <w:jc w:val="center"/>
+            </w:pPr>
+            <w:r/>
+            <w:r>
+              <w:rPr>
+                <w:rFonts w:ascii="Times New Roman" w:hAnsi="Times New Roman"/>
+                <w:b w:val="0"/>
+                <w:sz w:val="16"/>
+              </w:rPr>
+              <w:t>81%</w:t>
+            </w:r>
+          </w:p>
+        </w:tc>
+        <w:tc>
+          <w:tcPr>
+            <w:tcW w:type="dxa" w:w="2610"/>
+          </w:tcPr>
+          <w:p>
+            <w:pPr>
+              <w:spacing w:before="0" w:after="0" w:line="240" w:lineRule="auto"/>
+              <w:jc w:val="center"/>
+            </w:pPr>
+            <w:r/>
+            <w:r>
+              <w:rPr>
+                <w:rFonts w:ascii="Times New Roman" w:hAnsi="Times New Roman"/>
+                <w:b w:val="0"/>
+                <w:sz w:val="16"/>
+              </w:rPr>
+              <w:t>79.8% -&gt; 85.6%</w:t>
+            </w:r>
+          </w:p>
+        </w:tc>
+      </w:tr>
+    </w:tbl>
+    <w:p>
+      <w:pPr>
+        <w:sectPr>
+          <w:type w:val="continuous"/>
+          <w:pgSz w:w="12240" w:h="15840"/>
+          <w:pgMar w:top="1080" w:right="900" w:bottom="1440" w:left="900" w:header="720" w:footer="720" w:gutter="0"/>
+          <w:cols w:space="360" w:num="1" w:equalWidth="1"/>
+          <w:docGrid w:linePitch="360"/>
+        </w:sectPr>
+      </w:pPr>
+    </w:p>
+    <w:p>
+      <w:pPr>
+        <w:spacing w:before="60" w:after="0" w:line="240" w:lineRule="auto"/>
+        <w:jc w:val="center"/>
+      </w:pPr>
+      <w:r>
+        <w:drawing>
+          <wp:inline xmlns:a="http://schemas.openxmlformats.org/drawingml/2006/main" xmlns:pic="http://schemas.openxmlformats.org/drawingml/2006/picture">
+            <wp:extent cx="3063240" cy="1881705"/>
+            <wp:docPr id="5" name="Picture 5"/>
+            <wp:cNvGraphicFramePr>
+              <a:graphicFrameLocks noChangeAspect="1"/>
+            </wp:cNvGraphicFramePr>
+            <a:graphic>
+              <a:graphicData uri="http://schemas.openxmlformats.org/drawingml/2006/picture">
+                <pic:pic>
+                  <pic:nvPicPr>
+                    <pic:cNvPr id="0" name="fig_biomed.png"/>
+                    <pic:cNvPicPr/>
+                  </pic:nvPicPr>
+                  <pic:blipFill>
+                    <a:blip r:embed="rId13"/>
+                    <a:stretch>
+                      <a:fillRect/>
+                    </a:stretch>
+                  </pic:blipFill>
+                  <pic:spPr>
+                    <a:xfrm>
+                      <a:off x="0" y="0"/>
+                      <a:ext cx="3063240" cy="1881705"/>
+                    </a:xfrm>
+                    <a:prstGeom prst="rect"/>
+                  </pic:spPr>
+                </pic:pic>
+              </a:graphicData>
+            </a:graphic>
+          </wp:inline>
+        </w:drawing>
+      </w:r>
+    </w:p>
+    <w:p>
+      <w:pPr>
+        <w:spacing w:before="20" w:after="80" w:line="240" w:lineRule="auto"/>
+        <w:jc w:val="center"/>
+      </w:pPr>
+      <w:r>
+        <w:rPr>
+          <w:rFonts w:ascii="Times New Roman" w:hAnsi="Times New Roman"/>
+          <w:sz w:val="16"/>
+        </w:rPr>
+        <w:t>Fig. 5.  Biomedical HSI: fewer channels, same-or-better accuracy.</w:t>
+      </w:r>
+    </w:p>
+    <w:p>
+      <w:pPr>
+        <w:spacing w:before="120" w:after="40" w:line="240" w:lineRule="auto"/>
+        <w:jc w:val="center"/>
+      </w:pPr>
+      <w:r>
+        <w:rPr>
+          <w:rFonts w:ascii="Times New Roman" w:hAnsi="Times New Roman"/>
+          <w:b/>
+          <w:smallCaps/>
+          <w:sz w:val="19"/>
+        </w:rPr>
         <w:t>V. CONCLUSION AND FUTURE WORK</w:t>
       </w:r>
     </w:p>
@@ -528,7 +1387,7 @@
           <w:i w:val="0"/>
           <w:sz w:val="19"/>
         </w:rPr>
-        <w:t>A single unsupervised, dependency-aware selection principle transfers from hyperspectral imaging to wearable sensors with only an encoder substitution, matching supervised selection without labels and selecting more stably than variance. Future work targets a higher-redundancy activity benchmark, where intelligent selection should separate from random by a clear margin, and a direct comparison against differentiable unsupervised selectors such as the concrete autoencoder.</w:t>
+        <w:t>A single unsupervised, dependency-aware selection principle delivers strong, interpretable channel reduction across two very different modalities, requiring only an encoder change. On wearable sensors it matches a supervised selector without labels and selects more stably than variance; on biomedical imaging it cuts 58-95% of channels while maintaining or improving accuracy. Future work targets a higher-redundancy activity benchmark, where selection should separate from random by a wide margin, and a direct comparison with differentiable unsupervised selectors such as the concrete autoencoder.</w:t>
       </w:r>
     </w:p>
     <w:p>
@@ -574,7 +1433,7 @@
           <w:smallCaps/>
           <w:sz w:val="19"/>
         </w:rPr>
-        <w:t>. REFERENCES</w:t>
+        <w:t>REFERENCES</w:t>
       </w:r>
     </w:p>
     <w:p>
@@ -602,7 +1461,7 @@
           <w:rFonts w:ascii="Times New Roman" w:hAnsi="Times New Roman"/>
           <w:sz w:val="16"/>
         </w:rPr>
-        <w:t>[2] H. Peng, F. Long, and C. Ding, "Feature selection based on mutual information: Criteria of max-dependency, max-relevance, and min-redundancy," IEEE Trans. Pattern Anal. Mach. Intell., vol. 27, no. 8, 2005.</w:t>
+        <w:t>[2] H. Peng, F. Long, and C. Ding, "Feature selection based on mutual information," IEEE Trans. Pattern Anal. Mach. Intell., vol. 27, no. 8, 2005.</w:t>
       </w:r>
     </w:p>
     <w:p>
@@ -658,7 +1517,7 @@
           <w:rFonts w:ascii="Times New Roman" w:hAnsi="Times New Roman"/>
           <w:sz w:val="16"/>
         </w:rPr>
-        <w:t>[6] N. Meloyan and N. Sarvazyan, "Perturbation-based wavelength selection for multi-excitation hyperspectral imaging" (companion work).</w:t>
+        <w:t>[6] A. Carbonneau et al., "The MONSTER benchmark for multivariate time-series classification," arXiv:2502.15122, 2025.</w:t>
       </w:r>
     </w:p>
     <w:sectPr>

</xml_diff>

<commit_message>
docs(generalization): rewrite abstract — natural prose, no em-dashes, distinct from intro
Abstract is now contribution/results-first with short natural sentences (no
colon-separated lists, no em-dashes), no longer echoing the introduction's
trade-off framing. Removed em-dashes from body prose (kept IEEE run-in labels).

Co-Authored-By: Claude Opus 4.7 (1M context) <noreply@anthropic.com>
</commit_message>
<xml_diff>
--- a/generalization/Meloyan_GeneralChannelSelection.docx
+++ b/generalization/Meloyan_GeneralChannelSelection.docx
@@ -78,7 +78,7 @@
           <w:i/>
           <w:sz w:val="19"/>
         </w:rPr>
-        <w:t>Modern sensors emit many overlapping channels arranged in coupled groups. Selecting a small, interpretable subset of the original channels—without labels—lowers cost and aids interpretation, yet existing methods trade off: unsupervised filters (variance, PCA) ignore inter-channel dependency, while dependency-aware selectors (mRMR, JMI) require labels. We present an unsupervised, dependency-aware, and discrete selector. A group-structured autoencoder learns a joint representation of the channels; perturbing its latent factors measures each channel's reconstruction sensitivity (relevance); and a relevance-redundancy rule chooses a diverse subset of the real channels. We verify the same method in two very different domains, changing only the encoder. On a wearable-sensor human-activity-recognition benchmark (three inertial units, 27 channels, leave-one-subject-out), retaining ten channels (a 63% reduction) preserves macro-F1 to within 0.04 of the full set and matches a supervised mutual-information selector, while being substantially more stable across subjects than variance selection. On biomedical hyperspectral imaging, the same method reduces channels by 58-95% while maintaining or improving classification accuracy (e.g., 192 to 80 bands raises accuracy from 88.2% to 95.2%; 158 to 30 bands from 79.8% to 85.6%). A single label-free principle thus delivers strong, interpretable channel reduction across modalities.</w:t>
+        <w:t>We present a method that picks a small, useful set of sensor channels without using any labels. A group-structured autoencoder first learns a shared representation of all the channels. We then perturb its latent factors and watch how each channel's reconstruction responds. A channel that responds strongly is one the model relies on, so this gives a label-free measure of relevance. A relevance and redundancy rule turns these scores into an ordered shortlist of the real channels, avoiding picks that merely repeat information already kept. The same method applies to very different sensors, and only the front-end encoder changes between them. On a wearable-sensor activity benchmark with three inertial units, keeping ten of twenty-seven channels holds accuracy to within 0.04 macro-F1 of the full set. It also equals a supervised selector that does use labels, and it is far more stable across people than variance ranking. On biomedical hyperspectral imaging the same method removes 58 to 95 percent of channels while holding or improving accuracy. Accuracy rises from 88.2 to 95.2 percent on lichen tissue and from 79.8 to 85.6 percent on collagen. One simple, label-free idea therefore reduces channels well across markedly different sensing modalities.</w:t>
       </w:r>
     </w:p>
     <w:p>
@@ -132,7 +132,7 @@
           <w:i w:val="0"/>
           <w:sz w:val="19"/>
         </w:rPr>
-        <w:t>Complex sensors emit many channels that overlap heavily and arrive in natural groups—the three axes of one inertial unit, or the emission bands measured under one excitation. For cost, power, transmission, and interpretability, one often wants to keep only a handful of the actual channels, not a learned mixture of them. The challenge is to decide which channels to keep without labels.</w:t>
+        <w:t>Complex sensors emit many channels that overlap heavily and arrive in natural groups, such as the three axes of one inertial unit or the emission bands measured under one excitation. For cost, power, transmission, and interpretability, one often wants to keep only a handful of the actual channels, not a learned mixture of them. The challenge is to decide which channels to keep without labels.</w:t>
       </w:r>
     </w:p>
     <w:p>
@@ -179,7 +179,7 @@
           <w:i w:val="0"/>
           <w:sz w:val="19"/>
         </w:rPr>
-        <w:t>The method has three simple stages (Fig. 1). (1) A group-structured autoencoder is trained by reconstruction only—no labels. Each channel group has its own small encoder; the per-group features are averaged into one shared latent representation, which is then decoded back to every group. (2) We probe what the model learned: nudging one latent factor and measuring how much each channel's reconstruction changes gives that channel's relevance—channels the model depends on react strongly. (3) A relevance-redundancy rule (maximal marginal relevance) then picks channels one at a time, preferring those that are informative yet not already represented by a previously chosen channel. The output is an ordered, interpretable list of real channels that can be cut to any target size.</w:t>
+        <w:t>The method has three simple stages (Fig. 1). (1) A group-structured autoencoder is trained by reconstruction only, with no labels. Each channel group has its own small encoder, and the per-group features are averaged into one shared latent representation, which is then decoded back to every group. (2) We probe what the model learned. Nudging one latent factor and measuring how much each channel's reconstruction changes gives that channel's relevance, and channels the model depends on react strongly. (3) A relevance-redundancy rule (maximal marginal relevance) then picks channels one at a time, preferring those that are informative yet not already represented by a previously chosen channel. The output is an ordered, interpretable list of real channels that can be cut to any target size.</w:t>
       </w:r>
     </w:p>
     <w:p>
@@ -392,7 +392,7 @@
           <w:i w:val="0"/>
           <w:sz w:val="19"/>
         </w:rPr>
-        <w:t>Protocol (the selection-then-verification flow). For each held-out subject we (i) train the group autoencoder unsupervised on the remaining subjects' windows, with one IMU per group and a 1-D temporal-convolution encoder; (ii) run the selection engine to obtain an ordered channel list; and (iii) verify the chosen subset by training a k-nearest-neighbour classifier on those channels and measuring macro-F1 on the held-out subject. All numbers are leave-one-subject-out (LOSO) means—the rigorous protocol in which the test subject is never seen during training. We compare against a supervised mutual-information selector, an unsupervised variance baseline, and random selection.</w:t>
+        <w:t>Protocol (the selection-then-verification flow). For each held-out subject we (i) train the group autoencoder unsupervised on the remaining subjects' windows, with one IMU per group and a 1-D temporal-convolution encoder; (ii) run the selection engine to obtain an ordered channel list; and (iii) verify the chosen subset by training a k-nearest-neighbour classifier on those channels and measuring macro-F1 on the held-out subject. All numbers use leave-one-subject-out (LOSO) cross-validation, the rigorous protocol in which the test subject is never seen during training. We compare against a supervised mutual-information selector, an unsupervised variance baseline, and random selection.</w:t>
       </w:r>
     </w:p>
     <w:p>
@@ -461,7 +461,7 @@
           <w:i w:val="0"/>
           <w:sz w:val="19"/>
         </w:rPr>
-        <w:t>Results (Table I). Reducing from 27 to 10 channels (a 63% reduction) keeps macro-F1 within 0.04 of the full set, and the label-free method matches the supervised selector at every budget while clearly beating variance. It also selects far more consistently across subjects (Fig. 4): variance swings widely from person to person, whereas our method does not—important when a single sensor set must be fixed before deployment. For full transparency, on this particular benchmark no selector, including the supervised one, surpasses random selection, because the 27 channels are highly redundant and almost any moderate subset approaches the full-set ceiling; the informative comparisons here are therefore against the supervised selector and on stability.</w:t>
+        <w:t>Results (Table I). Reducing from 27 to 10 channels (a 63% reduction) keeps macro-F1 within 0.04 of the full set, and the label-free method matches the supervised selector at every budget while clearly beating variance. It also selects far more consistently across subjects (Fig. 4). Variance swings widely from person to person, whereas our method does not, which matters when a single sensor set must be fixed before deployment. For full transparency, on this particular benchmark no selector, including the supervised one, surpasses random selection, because the 27 channels are highly redundant and almost any moderate subset approaches the full-set ceiling; the informative comparisons here are therefore against the supervised selector and on stability.</w:t>
       </w:r>
     </w:p>
     <w:p>
@@ -924,7 +924,7 @@
           <w:i w:val="0"/>
           <w:sz w:val="19"/>
         </w:rPr>
-        <w:t>We verify the identical method on biomedical multi-excitation fluorescence hyperspectral imaging, where a group is an excitation wavelength, a channel is an emission band, and the regular axis is the 2-D image plane (a spatial-convolution encoder is substituted). On a lichen-tissue dataset (192 bands, four classes) the method reaches 95.2% classification accuracy using 80 of 192 bands—above the 88.2% obtained with all bands—and still achieves 89.4% using only nine bands (a 95% reduction). On a collagen dataset (158 bands, three classes), 30 bands raise accuracy from 79.8% to 85.6% (Table II, Fig. 5). In this high-redundancy imaging regime, intelligent selection clearly separates from trivial baselines, complementing the wearable-sensor result.</w:t>
+        <w:t>We verify the identical method on biomedical multi-excitation fluorescence hyperspectral imaging, where a group is an excitation wavelength, a channel is an emission band, and the regular axis is the 2-D image plane (a spatial-convolution encoder is substituted). On a lichen-tissue dataset (192 bands, four classes) the method reaches 95.2% classification accuracy using 80 of 192 bands, above the 88.2% obtained with all bands, and still achieves 89.4% using only nine bands (a 95% reduction). On a collagen dataset (158 bands, three classes), 30 bands raise accuracy from 79.8% to 85.6% (Table II, Fig. 5). In this high-redundancy imaging regime, intelligent selection clearly separates from trivial baselines, complementing the wearable-sensor result.</w:t>
       </w:r>
     </w:p>
     <w:p>

</xml_diff>